<commit_message>
Add both Dashboard One and Dashboard Two images and update documentation
</commit_message>
<xml_diff>
--- a/GitHub_ReadMe_File.docx
+++ b/GitHub_ReadMe_File.docx
@@ -21,7 +21,7 @@
     </w:p>
     <w:p>
       <w:pPr>
-        <w:spacing w:after="240" w:before="0"/>
+        <w:spacing w:after="200" w:before="0"/>
         <w:jc w:val="center"/>
       </w:pPr>
       <w:r>
@@ -38,7 +38,7 @@
     </w:p>
     <w:p>
       <w:pPr>
-        <w:spacing w:after="360" w:before="0"/>
+        <w:spacing w:after="300" w:before="0"/>
         <w:jc w:val="center"/>
       </w:pPr>
       <w:r>
@@ -46,17 +46,17 @@
           <w:rFonts w:ascii="Calibri" w:cs="Calibri" w:eastAsia="Calibri" w:hAnsi="Calibri"/>
           <w:i/>
           <w:iCs/>
-          <w:color w:val="666666"/>
+          <w:color w:val="555555"/>
           <w:sz w:val="20"/>
           <w:szCs w:val="20"/>
         </w:rPr>
-        <w:t xml:space="preserve">A Comprehensive Data Analytics Portfolio Project | Microsoft Excel Analytics &amp; Business Intelligence
-Author: Bimels Habtamu (@BimelsHabtamu)</w:t>
-      </w:r>
-    </w:p>
-    <w:p>
-      <w:pPr>
-        <w:spacing w:after="240" w:before="100"/>
+        <w:t xml:space="preserve">A Comprehensive Data Analytics Portfolio Project | Microsoft Excel Business Intelligence
+Author: Bimels Habtamu (GitHub: @BimelsHabtamu)</w:t>
+      </w:r>
+    </w:p>
+    <w:p>
+      <w:pPr>
+        <w:spacing w:after="200" w:before="100"/>
         <w:jc w:val="center"/>
       </w:pPr>
       <w:r>
@@ -114,7 +114,7 @@
           <w:sz w:val="18"/>
           <w:szCs w:val="18"/>
         </w:rPr>
-        <w:t xml:space="preserve">Figure 1: Secure Health General Hospital Clinical &amp; Analytics Review Team</w:t>
+        <w:t xml:space="preserve">Figure 1: Secure Health General Hospital Clinical &amp; Analytics Team</w:t>
       </w:r>
     </w:p>
     <w:p>
@@ -147,7 +147,7 @@
           <w:sz w:val="22"/>
           <w:szCs w:val="22"/>
         </w:rPr>
-        <w:t xml:space="preserve">Title: SECURE HEALTH GENERAL HOSPITAL PERFORMANCE DASHBOARD (Secure Life General Hospital Analytics Framework)</w:t>
+        <w:t xml:space="preserve">Project Title: SECURE HEALTH GENERAL HOSPITAL PERFORMANCE DASHBOARD (Secure Life General Hospital Analytics Framework)</w:t>
       </w:r>
     </w:p>
     <w:p>
@@ -1797,18 +1797,35 @@
           <w:sz w:val="22"/>
           <w:szCs w:val="22"/>
         </w:rPr>
-        <w:t xml:space="preserve">To empower executive stakeholders with real-time exploratory capability, an interactive dashboard was built in Microsoft Excel. The dashboard incorporates dynamic Pivot Tables, interconnected Slicers (Year, Department, Diagnosis), customized KPI callout cards, and clean visual encodings.</w:t>
-      </w:r>
-    </w:p>
-    <w:p>
-      <w:pPr>
-        <w:spacing w:after="200" w:before="120"/>
+        <w:t xml:space="preserve">To empower executive stakeholders with versatile exploratory capabilities, two distinct dashboard layouts were built in Microsoft Excel: Dashboard Example 1 (Classic Executive Layout) and Dashboard Example 2 (Icon-Enhanced Modern Executive Layout). Both dashboards deliver identical underlying metrics derived from the 1,000 patient records, offering flexible arrangements for executive presentations.</w:t>
+      </w:r>
+    </w:p>
+    <w:p>
+      <w:pPr>
+        <w:pStyle w:val="Heading2"/>
+        <w:spacing w:after="120" w:before="260"/>
+      </w:pPr>
+      <w:r>
+        <w:rPr>
+          <w:rFonts w:ascii="Calibri" w:cs="Calibri" w:eastAsia="Calibri" w:hAnsi="Calibri"/>
+          <w:b/>
+          <w:bCs/>
+          <w:color w:val="008080"/>
+          <w:sz w:val="26"/>
+          <w:szCs w:val="26"/>
+        </w:rPr>
+        <w:t xml:space="preserve">Dashboard Example 1: Classic Executive Layout (Secure Life General Hospital)</w:t>
+      </w:r>
+    </w:p>
+    <w:p>
+      <w:pPr>
+        <w:spacing w:after="160" w:before="120"/>
         <w:jc w:val="center"/>
       </w:pPr>
       <w:r>
         <w:drawing>
           <wp:inline distT="0" distB="0" distL="0" distR="0">
-            <wp:extent cx="5619750" cy="3048000"/>
+            <wp:extent cx="5619750" cy="2476500"/>
             <wp:effectExtent t="0" r="0" b="0" l="0"/>
             <wp:docPr id="2" name=""/>
             <wp:cNvGraphicFramePr>
@@ -1833,7 +1850,7 @@
                   <pic:spPr bwMode="auto">
                     <a:xfrm>
                       <a:off x="0" y="0"/>
-                      <a:ext cx="5619750" cy="3048000"/>
+                      <a:ext cx="5619750" cy="2476500"/>
                     </a:xfrm>
                     <a:prstGeom prst="rect">
                       <a:avLst/>
@@ -1848,7 +1865,7 @@
     </w:p>
     <w:p>
       <w:pPr>
-        <w:spacing w:after="260" w:before="0"/>
+        <w:spacing w:after="200" w:before="0"/>
         <w:jc w:val="center"/>
       </w:pPr>
       <w:r>
@@ -1860,7 +1877,23 @@
           <w:sz w:val="18"/>
           <w:szCs w:val="18"/>
         </w:rPr>
-        <w:t xml:space="preserve">Figure 2: Secure Health General Hospital Interactive Performance Dashboard</w:t>
+        <w:t xml:space="preserve">Figure 2: Dashboard Example 1 — Classic Executive Layout (Clean, High-Readability Format)</w:t>
+      </w:r>
+    </w:p>
+    <w:p>
+      <w:pPr>
+        <w:spacing w:after="120" w:before="80" w:line="280"/>
+      </w:pPr>
+      <w:r>
+        <w:rPr>
+          <w:rFonts w:ascii="Calibri" w:cs="Calibri" w:eastAsia="Calibri" w:hAnsi="Calibri"/>
+          <w:b w:val="false"/>
+          <w:bCs w:val="false"/>
+          <w:color w:val="2B2B2B"/>
+          <w:sz w:val="22"/>
+          <w:szCs w:val="22"/>
+        </w:rPr>
+        <w:t xml:space="preserve">Dashboard 1 Features: Features clean KPI metric cards on the left panel (No. of Patients: 1,000, Total Bill Amt.: $8,053,143, Avg. Stay Length: 4.8, Paid Amount: $4,568,527, Avg. Insurance(%): 75%), alongside dual-column slicers for Department and Year, and a multi-select Diagnosis slicer. The visualization grid features Admission Trend Over Time (line chart), No. of Patients by Department (horizontal bar), No. of Patients by Age Group (vertical column), Payment Status (%) (donut chart), and Patients by Gender (column chart).</w:t>
       </w:r>
     </w:p>
     <w:p>
@@ -1877,217 +1910,86 @@
           <w:sz w:val="26"/>
           <w:szCs w:val="26"/>
         </w:rPr>
-        <w:t xml:space="preserve">Dashboard Components &amp; Visual Encodings</w:t>
-      </w:r>
-    </w:p>
-    <w:p>
-      <w:pPr>
-        <w:pStyle w:val="ListParagraph"/>
-        <w:numPr>
-          <w:ilvl w:val="0"/>
-          <w:numId w:val="1"/>
-        </w:numPr>
-        <w:spacing w:after="60" w:before="60" w:line="260"/>
-      </w:pPr>
-      <w:r>
-        <w:rPr>
-          <w:rFonts w:ascii="Calibri" w:cs="Calibri" w:eastAsia="Calibri" w:hAnsi="Calibri"/>
-          <w:b/>
-          <w:bCs/>
-          <w:color w:val="1B365D"/>
-          <w:sz w:val="22"/>
-          <w:szCs w:val="22"/>
-        </w:rPr>
-        <w:t xml:space="preserve">Executive KPI Cards (Left Panel):</w:t>
-      </w:r>
-      <w:r>
-        <w:rPr>
-          <w:rFonts w:ascii="Calibri" w:cs="Calibri" w:eastAsia="Calibri" w:hAnsi="Calibri"/>
-          <w:color w:val="2B2B2B"/>
-          <w:sz w:val="22"/>
-          <w:szCs w:val="22"/>
-        </w:rPr>
-        <w:t xml:space="preserve"> Displays high-level operational vitals: Total Billed Revenue ($8,053,143.44), Total Cash Collected ($5,269,442.16 with partial recoveries / $4,568,527.32 fully settled), Total Patient Visits (1,000), and Average Insurance Coverage (74.86%).</w:t>
-      </w:r>
-    </w:p>
-    <w:p>
-      <w:pPr>
-        <w:pStyle w:val="ListParagraph"/>
-        <w:numPr>
-          <w:ilvl w:val="0"/>
-          <w:numId w:val="1"/>
-        </w:numPr>
-        <w:spacing w:after="60" w:before="60" w:line="260"/>
-      </w:pPr>
-      <w:r>
-        <w:rPr>
-          <w:rFonts w:ascii="Calibri" w:cs="Calibri" w:eastAsia="Calibri" w:hAnsi="Calibri"/>
-          <w:b/>
-          <w:bCs/>
-          <w:color w:val="1B365D"/>
-          <w:sz w:val="22"/>
-          <w:szCs w:val="22"/>
-        </w:rPr>
-        <w:t xml:space="preserve">Payment Status Breakdown (Donut/Pie Chart):</w:t>
-      </w:r>
-      <w:r>
-        <w:rPr>
-          <w:rFonts w:ascii="Calibri" w:cs="Calibri" w:eastAsia="Calibri" w:hAnsi="Calibri"/>
-          <w:color w:val="2B2B2B"/>
-          <w:sz w:val="22"/>
-          <w:szCs w:val="22"/>
-        </w:rPr>
-        <w:t xml:space="preserve"> Depicts account resolution proportions: 56.4% Paid, 25.7% Pending, and 17.9% Partially Paid.</w:t>
-      </w:r>
-    </w:p>
-    <w:p>
-      <w:pPr>
-        <w:pStyle w:val="ListParagraph"/>
-        <w:numPr>
-          <w:ilvl w:val="0"/>
-          <w:numId w:val="1"/>
-        </w:numPr>
-        <w:spacing w:after="60" w:before="60" w:line="260"/>
-      </w:pPr>
-      <w:r>
-        <w:rPr>
-          <w:rFonts w:ascii="Calibri" w:cs="Calibri" w:eastAsia="Calibri" w:hAnsi="Calibri"/>
-          <w:b/>
-          <w:bCs/>
-          <w:color w:val="1B365D"/>
-          <w:sz w:val="22"/>
-          <w:szCs w:val="22"/>
-        </w:rPr>
-        <w:t xml:space="preserve">Department Performance (Horizontal Bar Chart):</w:t>
-      </w:r>
-      <w:r>
-        <w:rPr>
-          <w:rFonts w:ascii="Calibri" w:cs="Calibri" w:eastAsia="Calibri" w:hAnsi="Calibri"/>
-          <w:color w:val="2B2B2B"/>
-          <w:sz w:val="22"/>
-          <w:szCs w:val="22"/>
-        </w:rPr>
-        <w:t xml:space="preserve"> Compares patient volume throughput against gross billing across General, Emergency, Orthopedics, Pediatrics, Cardiology, and Neurology.</w:t>
-      </w:r>
-    </w:p>
-    <w:p>
-      <w:pPr>
-        <w:pStyle w:val="ListParagraph"/>
-        <w:numPr>
-          <w:ilvl w:val="0"/>
-          <w:numId w:val="1"/>
-        </w:numPr>
-        <w:spacing w:after="60" w:before="60" w:line="260"/>
-      </w:pPr>
-      <w:r>
-        <w:rPr>
-          <w:rFonts w:ascii="Calibri" w:cs="Calibri" w:eastAsia="Calibri" w:hAnsi="Calibri"/>
-          <w:b/>
-          <w:bCs/>
-          <w:color w:val="1B365D"/>
-          <w:sz w:val="22"/>
-          <w:szCs w:val="22"/>
-        </w:rPr>
-        <w:t xml:space="preserve">Insurance Coverage by Department (Column Chart):</w:t>
-      </w:r>
-      <w:r>
-        <w:rPr>
-          <w:rFonts w:ascii="Calibri" w:cs="Calibri" w:eastAsia="Calibri" w:hAnsi="Calibri"/>
-          <w:color w:val="2B2B2B"/>
-          <w:sz w:val="22"/>
-          <w:szCs w:val="22"/>
-        </w:rPr>
-        <w:t xml:space="preserve"> Visualizes average insurance reimbursement rates, highlighting departmental variance between 73.89% and 76.32%.</w:t>
-      </w:r>
-    </w:p>
-    <w:p>
-      <w:pPr>
-        <w:pStyle w:val="ListParagraph"/>
-        <w:numPr>
-          <w:ilvl w:val="0"/>
-          <w:numId w:val="1"/>
-        </w:numPr>
-        <w:spacing w:after="60" w:before="60" w:line="260"/>
-      </w:pPr>
-      <w:r>
-        <w:rPr>
-          <w:rFonts w:ascii="Calibri" w:cs="Calibri" w:eastAsia="Calibri" w:hAnsi="Calibri"/>
-          <w:b/>
-          <w:bCs/>
-          <w:color w:val="1B365D"/>
-          <w:sz w:val="22"/>
-          <w:szCs w:val="22"/>
-        </w:rPr>
-        <w:t xml:space="preserve">Monthly Admissions Trend (24-Month Temporal Line/Column Chart):</w:t>
-      </w:r>
-      <w:r>
-        <w:rPr>
-          <w:rFonts w:ascii="Calibri" w:cs="Calibri" w:eastAsia="Calibri" w:hAnsi="Calibri"/>
-          <w:color w:val="2B2B2B"/>
-          <w:sz w:val="22"/>
-          <w:szCs w:val="22"/>
-        </w:rPr>
-        <w:t xml:space="preserve"> Tracks monthly admissions across 2024 and 2025, illuminating cyclical demand spikes in November, July, and January.</w:t>
-      </w:r>
-    </w:p>
-    <w:p>
-      <w:pPr>
-        <w:pStyle w:val="ListParagraph"/>
-        <w:numPr>
-          <w:ilvl w:val="0"/>
-          <w:numId w:val="1"/>
-        </w:numPr>
-        <w:spacing w:after="60" w:before="60" w:line="260"/>
-      </w:pPr>
-      <w:r>
-        <w:rPr>
-          <w:rFonts w:ascii="Calibri" w:cs="Calibri" w:eastAsia="Calibri" w:hAnsi="Calibri"/>
-          <w:b/>
-          <w:bCs/>
-          <w:color w:val="1B365D"/>
-          <w:sz w:val="22"/>
-          <w:szCs w:val="22"/>
-        </w:rPr>
-        <w:t xml:space="preserve">Average Length of Stay by Department (Line Chart):</w:t>
-      </w:r>
-      <w:r>
-        <w:rPr>
-          <w:rFonts w:ascii="Calibri" w:cs="Calibri" w:eastAsia="Calibri" w:hAnsi="Calibri"/>
-          <w:color w:val="2B2B2B"/>
-          <w:sz w:val="22"/>
-          <w:szCs w:val="22"/>
-        </w:rPr>
-        <w:t xml:space="preserve"> Exhibits patient inpatient recovery duration, highlighting surgical units (Orthopedics: 8.38 days) vs outpatient triage (Emergency: 2.03 days).</w:t>
-      </w:r>
-    </w:p>
-    <w:p>
-      <w:pPr>
-        <w:pStyle w:val="ListParagraph"/>
-        <w:numPr>
-          <w:ilvl w:val="0"/>
-          <w:numId w:val="1"/>
-        </w:numPr>
-        <w:spacing w:after="60" w:before="60" w:line="260"/>
-      </w:pPr>
-      <w:r>
-        <w:rPr>
-          <w:rFonts w:ascii="Calibri" w:cs="Calibri" w:eastAsia="Calibri" w:hAnsi="Calibri"/>
-          <w:b/>
-          <w:bCs/>
-          <w:color w:val="1B365D"/>
-          <w:sz w:val="22"/>
-          <w:szCs w:val="22"/>
-        </w:rPr>
-        <w:t xml:space="preserve">Patient Volume by Age Cohort (Bar/Column Chart):</w:t>
-      </w:r>
-      <w:r>
-        <w:rPr>
-          <w:rFonts w:ascii="Calibri" w:cs="Calibri" w:eastAsia="Calibri" w:hAnsi="Calibri"/>
-          <w:color w:val="2B2B2B"/>
-          <w:sz w:val="22"/>
-          <w:szCs w:val="22"/>
-        </w:rPr>
-        <w:t xml:space="preserve"> Maps patient counts across demographic brackets to isolate primary consumer cohorts.</w:t>
+        <w:t xml:space="preserve">Dashboard Example 2: Icon-Enhanced Modern Executive Layout (SecureHealth)</w:t>
+      </w:r>
+    </w:p>
+    <w:p>
+      <w:pPr>
+        <w:spacing w:after="160" w:before="120"/>
+        <w:jc w:val="center"/>
+      </w:pPr>
+      <w:r>
+        <w:drawing>
+          <wp:inline distT="0" distB="0" distL="0" distR="0">
+            <wp:extent cx="5619750" cy="2476500"/>
+            <wp:effectExtent t="0" r="0" b="0" l="0"/>
+            <wp:docPr id="3" name=""/>
+            <wp:cNvGraphicFramePr>
+              <a:graphicFrameLocks xmlns:a="http://schemas.openxmlformats.org/drawingml/2006/main" noChangeAspect="1"/>
+            </wp:cNvGraphicFramePr>
+            <a:graphic xmlns:a="http://schemas.openxmlformats.org/drawingml/2006/main">
+              <a:graphicData uri="http://schemas.openxmlformats.org/drawingml/2006/picture">
+                <pic:pic xmlns:pic="http://schemas.openxmlformats.org/drawingml/2006/picture">
+                  <pic:nvPicPr>
+                    <pic:cNvPr id="0" name="" descr=""/>
+                    <pic:cNvPicPr>
+                      <a:picLocks noChangeAspect="1" noChangeArrowheads="1"/>
+                    </pic:cNvPicPr>
+                  </pic:nvPicPr>
+                  <pic:blipFill>
+                    <a:blip r:embed="rId9" cstate="none"/>
+                    <a:srcRect/>
+                    <a:stretch>
+                      <a:fillRect/>
+                    </a:stretch>
+                  </pic:blipFill>
+                  <pic:spPr bwMode="auto">
+                    <a:xfrm>
+                      <a:off x="0" y="0"/>
+                      <a:ext cx="5619750" cy="2476500"/>
+                    </a:xfrm>
+                    <a:prstGeom prst="rect">
+                      <a:avLst/>
+                    </a:prstGeom>
+                  </pic:spPr>
+                </pic:pic>
+              </a:graphicData>
+            </a:graphic>
+          </wp:inline>
+        </w:drawing>
+      </w:r>
+    </w:p>
+    <w:p>
+      <w:pPr>
+        <w:spacing w:after="200" w:before="0"/>
+        <w:jc w:val="center"/>
+      </w:pPr>
+      <w:r>
+        <w:rPr>
+          <w:rFonts w:ascii="Calibri" w:cs="Calibri" w:eastAsia="Calibri" w:hAnsi="Calibri"/>
+          <w:i/>
+          <w:iCs/>
+          <w:color w:val="777777"/>
+          <w:sz w:val="18"/>
+          <w:szCs w:val="18"/>
+        </w:rPr>
+        <w:t xml:space="preserve">Figure 3: Dashboard Example 2 — Icon-Enhanced Modern Layout (Custom Icons &amp; Horizontal Demographics)</w:t>
+      </w:r>
+    </w:p>
+    <w:p>
+      <w:pPr>
+        <w:spacing w:after="120" w:before="80" w:line="280"/>
+      </w:pPr>
+      <w:r>
+        <w:rPr>
+          <w:rFonts w:ascii="Calibri" w:cs="Calibri" w:eastAsia="Calibri" w:hAnsi="Calibri"/>
+          <w:b w:val="false"/>
+          <w:bCs w:val="false"/>
+          <w:color w:val="2B2B2B"/>
+          <w:sz w:val="22"/>
+          <w:szCs w:val="22"/>
+        </w:rPr>
+        <w:t xml:space="preserve">Dashboard 2 Features: Enriched with custom medical iconography (hospital emblem, patient avatar, currency stack, hospital bed, PAID stamp, and shield), paired with a dark navy title banner. The layout pairs Admission Trend Over Time with a horizontal Patients by Age Group bar chart in the top row, and No. of Patients by Dept., Payment Status (%), and Patient Gender (%) in the lower row.</w:t>
       </w:r>
     </w:p>
     <w:p>
@@ -3847,7 +3749,7 @@
           <w:sz w:val="22"/>
           <w:szCs w:val="22"/>
         </w:rPr>
-        <w:t xml:space="preserve"> 564 accounts (56.40% of patient encounters), representing $4,568,527.32 (56.73% of total billed dollars).</w:t>
+        <w:t xml:space="preserve"> 564 accounts (56.40% of patient encounters / 57% rounded), representing $4,568,527.32 (56.73% of total billed dollars).</w:t>
       </w:r>
     </w:p>
     <w:p>
@@ -3877,7 +3779,7 @@
           <w:sz w:val="22"/>
           <w:szCs w:val="22"/>
         </w:rPr>
-        <w:t xml:space="preserve"> 257 accounts (25.70% of patient encounters), representing $2,082,786.44 (25.86% of total billed dollars).</w:t>
+        <w:t xml:space="preserve"> 257 accounts (25.70% of patient encounters / 26% rounded), representing $2,082,786.44 (25.86% of total billed dollars).</w:t>
       </w:r>
     </w:p>
     <w:p>
@@ -3907,7 +3809,7 @@
           <w:sz w:val="22"/>
           <w:szCs w:val="22"/>
         </w:rPr>
-        <w:t xml:space="preserve"> 179 accounts (17.90% of patient encounters), representing $1,401,829.68 (17.41% of total billed dollars).</w:t>
+        <w:t xml:space="preserve"> 179 accounts (17.90% of patient encounters / 17% rounded), representing $1,401,829.68 (17.41% of total billed dollars).</w:t>
       </w:r>
     </w:p>
     <w:p>
@@ -4125,7 +4027,7 @@
           <w:sz w:val="22"/>
           <w:szCs w:val="22"/>
         </w:rPr>
-        <w:t xml:space="preserve">The hospital-wide average insurance coverage is 74.86%, meaning private or government insurance covers nearly three-quarters of costs on average. However, the residual 25.14% ($2,024,400+ aggregate) is borne directly by patients as co-pays, deductibles, or out-of-pocket expenses.</w:t>
+        <w:t xml:space="preserve">The hospital-wide average insurance coverage is 74.86% (~75%), meaning private or government insurance covers nearly three-quarters of costs on average. However, the residual 25.14% ($2,024,400+ aggregate) is borne directly by patients as co-pays, deductibles, or out-of-pocket expenses.</w:t>
       </w:r>
     </w:p>
     <w:p>
@@ -5073,7 +4975,7 @@
           <w:sz w:val="22"/>
           <w:szCs w:val="22"/>
         </w:rPr>
-        <w:t xml:space="preserve">Patients aged 51 and older represent 46.70% (467 visits) of all hospital encounters. Gender distribution is remarkably balanced: Female patients account for 51.2% (512 visits) and Male patients account for 48.8% (488 visits).</w:t>
+        <w:t xml:space="preserve">Patients aged 51 and older represent 46.70% (467 visits) of all hospital encounters. Gender distribution is remarkably balanced: Female patients account for 51.2% (512 visits / 51% rounded) and Male patients account for 48.8% (488 visits / 49% rounded).</w:t>
       </w:r>
     </w:p>
     <w:p>

</xml_diff>